<commit_message>
V2: Inclusion de la red de padaggia
</commit_message>
<xml_diff>
--- a/CONVOCATORIA DEVNET.docx
+++ b/CONVOCATORIA DEVNET.docx
@@ -1,6 +1,6 @@
 
 <file path=word/document.xml><?xml version="1.0" encoding="utf-8"?>
-<w:document xmlns:wpc="http://schemas.microsoft.com/office/word/2010/wordprocessingCanvas" xmlns:cx="http://schemas.microsoft.com/office/drawing/2014/chartex" xmlns:cx1="http://schemas.microsoft.com/office/drawing/2015/9/8/chartex" xmlns:cx2="http://schemas.microsoft.com/office/drawing/2015/10/21/chartex" xmlns:cx3="http://schemas.microsoft.com/office/drawing/2016/5/9/chartex" xmlns:cx4="http://schemas.microsoft.com/office/drawing/2016/5/10/chartex" xmlns:cx5="http://schemas.microsoft.com/office/drawing/2016/5/11/chartex" xmlns:cx6="http://schemas.microsoft.com/office/drawing/2016/5/12/chartex" xmlns:cx7="http://schemas.microsoft.com/office/drawing/2016/5/13/chartex" xmlns:cx8="http://schemas.microsoft.com/office/drawing/2016/5/14/chartex" xmlns:mc="http://schemas.openxmlformats.org/markup-compatibility/2006" xmlns:aink="http://schemas.microsoft.com/office/drawing/2016/ink" xmlns:am3d="http://schemas.microsoft.com/office/drawing/2017/model3d" xmlns:o="urn:schemas-microsoft-com:office:office" xmlns:oel="http://schemas.microsoft.com/office/2019/extlst" xmlns:r="http://schemas.openxmlformats.org/officeDocument/2006/relationships" xmlns:m="http://schemas.openxmlformats.org/officeDocument/2006/math" xmlns:v="urn:schemas-microsoft-com:vml" xmlns:wp14="http://schemas.microsoft.com/office/word/2010/wordprocessingDrawing" xmlns:wp="http://schemas.openxmlformats.org/drawingml/2006/wordprocessingDrawing" xmlns:w10="urn:schemas-microsoft-com:office:word" xmlns:w="http://schemas.openxmlformats.org/wordprocessingml/2006/main" xmlns:w14="http://schemas.microsoft.com/office/word/2010/wordml" xmlns:w15="http://schemas.microsoft.com/office/word/2012/wordml" xmlns:w16cex="http://schemas.microsoft.com/office/word/2018/wordml/cex" xmlns:w16cid="http://schemas.microsoft.com/office/word/2016/wordml/cid" xmlns:w16="http://schemas.microsoft.com/office/word/2018/wordml" xmlns:w16du="http://schemas.microsoft.com/office/word/2023/wordml/word16du" xmlns:w16sdtdh="http://schemas.microsoft.com/office/word/2020/wordml/sdtdatahash" xmlns:w16sdtfl="http://schemas.microsoft.com/office/word/2024/wordml/sdtformatlock" xmlns:w16se="http://schemas.microsoft.com/office/word/2015/wordml/symex" xmlns:wpg="http://schemas.microsoft.com/office/word/2010/wordprocessingGroup" xmlns:wpi="http://schemas.microsoft.com/office/word/2010/wordprocessingInk" xmlns:wne="http://schemas.microsoft.com/office/word/2006/wordml" xmlns:wps="http://schemas.microsoft.com/office/word/2010/wordprocessingShape" mc:Ignorable="w14 w15 w16se w16cid w16 w16cex w16sdtdh w16sdtfl w16du wp14">
+<w:document xmlns:wpc="http://schemas.microsoft.com/office/word/2010/wordprocessingCanvas" xmlns:cx="http://schemas.microsoft.com/office/drawing/2014/chartex" xmlns:cx1="http://schemas.microsoft.com/office/drawing/2015/9/8/chartex" xmlns:cx2="http://schemas.microsoft.com/office/drawing/2015/10/21/chartex" xmlns:cx3="http://schemas.microsoft.com/office/drawing/2016/5/9/chartex" xmlns:cx4="http://schemas.microsoft.com/office/drawing/2016/5/10/chartex" xmlns:cx5="http://schemas.microsoft.com/office/drawing/2016/5/11/chartex" xmlns:cx6="http://schemas.microsoft.com/office/drawing/2016/5/12/chartex" xmlns:cx7="http://schemas.microsoft.com/office/drawing/2016/5/13/chartex" xmlns:cx8="http://schemas.microsoft.com/office/drawing/2016/5/14/chartex" xmlns:mc="http://schemas.openxmlformats.org/markup-compatibility/2006" xmlns:aink="http://schemas.microsoft.com/office/drawing/2016/ink" xmlns:am3d="http://schemas.microsoft.com/office/drawing/2017/model3d" xmlns:o="urn:schemas-microsoft-com:office:office" xmlns:r="http://schemas.openxmlformats.org/officeDocument/2006/relationships" xmlns:m="http://schemas.openxmlformats.org/officeDocument/2006/math" xmlns:v="urn:schemas-microsoft-com:vml" xmlns:wp14="http://schemas.microsoft.com/office/word/2010/wordprocessingDrawing" xmlns:wp="http://schemas.openxmlformats.org/drawingml/2006/wordprocessingDrawing" xmlns:w10="urn:schemas-microsoft-com:office:word" xmlns:w="http://schemas.openxmlformats.org/wordprocessingml/2006/main" xmlns:w14="http://schemas.microsoft.com/office/word/2010/wordml" xmlns:w15="http://schemas.microsoft.com/office/word/2012/wordml" xmlns:w16cex="http://schemas.microsoft.com/office/word/2018/wordml/cex" xmlns:w16cid="http://schemas.microsoft.com/office/word/2016/wordml/cid" xmlns:w16="http://schemas.microsoft.com/office/word/2018/wordml" xmlns:w16sdtdh="http://schemas.microsoft.com/office/word/2020/wordml/sdtdatahash" xmlns:w16se="http://schemas.microsoft.com/office/word/2015/wordml/symex" xmlns:wpg="http://schemas.microsoft.com/office/word/2010/wordprocessingGroup" xmlns:wpi="http://schemas.microsoft.com/office/word/2010/wordprocessingInk" xmlns:wne="http://schemas.microsoft.com/office/word/2006/wordml" xmlns:wps="http://schemas.microsoft.com/office/word/2010/wordprocessingShape" mc:Ignorable="w14 w15 w16se w16cid w16 w16cex w16sdtdh wp14">
   <w:body>
     <w:p>
       <w:pPr>
@@ -87,7 +87,6 @@
           <w:lang w:eastAsia="es-ES"/>
         </w:rPr>
       </w:pPr>
-      <w:proofErr w:type="spellStart"/>
       <w:r>
         <w:rPr>
           <w:rFonts w:asciiTheme="majorHAnsi" w:eastAsia="Times New Roman" w:hAnsiTheme="majorHAnsi" w:cstheme="majorHAnsi"/>
@@ -98,7 +97,6 @@
         </w:rPr>
         <w:t>DevNet</w:t>
       </w:r>
-      <w:proofErr w:type="spellEnd"/>
       <w:r>
         <w:rPr>
           <w:rFonts w:asciiTheme="majorHAnsi" w:eastAsia="Times New Roman" w:hAnsiTheme="majorHAnsi" w:cstheme="majorHAnsi"/>
@@ -555,6 +553,88 @@
           </w:p>
         </w:tc>
       </w:tr>
+      <w:tr>
+        <w:trPr>
+          <w:trHeight w:val="300"/>
+        </w:trPr>
+        <w:tc>
+          <w:tcPr>
+            <w:tcW w:w="0" w:type="auto"/>
+            <w:vAlign w:val="center"/>
+          </w:tcPr>
+          <w:p>
+            <w:pPr>
+              <w:spacing w:after="0"/>
+              <w:jc w:val="center"/>
+              <w:rPr>
+                <w:rFonts w:asciiTheme="majorHAnsi" w:hAnsiTheme="majorHAnsi" w:cstheme="majorHAnsi"/>
+                <w:color w:val="000000" w:themeColor="text1"/>
+              </w:rPr>
+            </w:pPr>
+            <w:r>
+              <w:rPr>
+                <w:rStyle w:val="Textoennegrita"/>
+                <w:rFonts w:ascii="Arial" w:hAnsi="Arial" w:cs="Arial"/>
+                <w:color w:val="1F1F1F"/>
+                <w:shd w:val="clear" w:color="auto" w:fill="FFFFFF"/>
+              </w:rPr>
+              <w:t>INSTITUCIONAL DE PEDAGOGÍA</w:t>
+            </w:r>
+          </w:p>
+        </w:tc>
+        <w:tc>
+          <w:tcPr>
+            <w:tcW w:w="0" w:type="auto"/>
+            <w:vAlign w:val="center"/>
+          </w:tcPr>
+          <w:p>
+            <w:pPr>
+              <w:spacing w:after="0" w:line="240" w:lineRule="auto"/>
+              <w:jc w:val="center"/>
+              <w:rPr>
+                <w:rFonts w:asciiTheme="majorHAnsi" w:hAnsiTheme="majorHAnsi" w:cstheme="majorHAnsi"/>
+                <w:color w:val="000000" w:themeColor="text1"/>
+                <w:lang w:bidi="es-ES"/>
+              </w:rPr>
+            </w:pPr>
+            <w:r>
+              <w:rPr>
+                <w:rStyle w:val="Textoennegrita"/>
+                <w:rFonts w:ascii="Arial" w:hAnsi="Arial" w:cs="Arial"/>
+                <w:color w:val="1F1F1F"/>
+                <w:shd w:val="clear" w:color="auto" w:fill="FFFFFF"/>
+              </w:rPr>
+              <w:t>TODAS</w:t>
+            </w:r>
+          </w:p>
+        </w:tc>
+        <w:tc>
+          <w:tcPr>
+            <w:tcW w:w="4627" w:type="dxa"/>
+            <w:vAlign w:val="center"/>
+          </w:tcPr>
+          <w:p>
+            <w:pPr>
+              <w:spacing w:after="0" w:line="240" w:lineRule="auto"/>
+              <w:jc w:val="both"/>
+              <w:rPr>
+                <w:rFonts w:asciiTheme="majorHAnsi" w:hAnsiTheme="majorHAnsi" w:cstheme="majorHAnsi"/>
+                <w:color w:val="000000" w:themeColor="text1"/>
+                <w:lang w:bidi="es-ES"/>
+              </w:rPr>
+            </w:pPr>
+            <w:r>
+              <w:rPr>
+                <w:rStyle w:val="Textoennegrita"/>
+                <w:rFonts w:ascii="Arial" w:hAnsi="Arial" w:cs="Arial"/>
+                <w:color w:val="1F1F1F"/>
+                <w:shd w:val="clear" w:color="auto" w:fill="FFFFFF"/>
+              </w:rPr>
+              <w:t>Implementar soluciones tecnológicas en la formación</w:t>
+            </w:r>
+          </w:p>
+        </w:tc>
+      </w:tr>
     </w:tbl>
     <w:bookmarkEnd w:id="0"/>
     <w:p>
@@ -691,9 +771,8 @@
           <w:sz w:val="22"/>
           <w:szCs w:val="22"/>
         </w:rPr>
-        <w:t xml:space="preserve">En este contexto, </w:t>
-      </w:r>
-      <w:proofErr w:type="spellStart"/>
+        <w:t xml:space="preserve">En este contexto, DevNet se presenta como una iniciativa clave que integra el desarrollo de software con el conocimiento en redes, permitiendo a los profesionales automatizar tareas, </w:t>
+      </w:r>
       <w:r>
         <w:rPr>
           <w:rFonts w:asciiTheme="majorHAnsi" w:hAnsiTheme="majorHAnsi" w:cstheme="majorHAnsi"/>
@@ -701,9 +780,9 @@
           <w:sz w:val="22"/>
           <w:szCs w:val="22"/>
         </w:rPr>
-        <w:t>DevNet</w:t>
-      </w:r>
-      <w:proofErr w:type="spellEnd"/>
+        <w:lastRenderedPageBreak/>
+        <w:t>integrar sistemas, mejorar tiempos de respuesta ante incidentes y reducir la complejidad operativa en entornos de red híbridos (físicos y virtualizados)</w:t>
+      </w:r>
       <w:r>
         <w:rPr>
           <w:rFonts w:asciiTheme="majorHAnsi" w:hAnsiTheme="majorHAnsi" w:cstheme="majorHAnsi"/>
@@ -711,7 +790,7 @@
           <w:sz w:val="22"/>
           <w:szCs w:val="22"/>
         </w:rPr>
-        <w:t xml:space="preserve"> se presenta como una iniciativa clave que integra el desarrollo de software con el conocimiento en redes, permitiendo a los profesionales automatizar tareas, integrar sistemas, mejorar tiempos de respuesta ante incidentes y reducir la complejidad operativa en entornos de red híbridos (físicos y virtualizados)</w:t>
+        <w:t xml:space="preserve">, avanzando así </w:t>
       </w:r>
       <w:r>
         <w:rPr>
@@ -720,8 +799,19 @@
           <w:sz w:val="22"/>
           <w:szCs w:val="22"/>
         </w:rPr>
-        <w:t xml:space="preserve">, avanzando así </w:t>
-      </w:r>
+        <w:t>hacia modelos de operación más ágiles, escalables y sostenibles en sectores como educación, salud, agricultura, industria y administración pública.</w:t>
+      </w:r>
+    </w:p>
+    <w:p>
+      <w:pPr>
+        <w:pStyle w:val="NormalWeb"/>
+        <w:jc w:val="both"/>
+        <w:rPr>
+          <w:rFonts w:asciiTheme="majorHAnsi" w:hAnsiTheme="majorHAnsi" w:cstheme="majorHAnsi"/>
+          <w:b/>
+          <w:bCs/>
+        </w:rPr>
+      </w:pPr>
       <w:r>
         <w:rPr>
           <w:rFonts w:asciiTheme="majorHAnsi" w:hAnsiTheme="majorHAnsi" w:cstheme="majorHAnsi"/>
@@ -729,7 +819,7 @@
           <w:sz w:val="22"/>
           <w:szCs w:val="22"/>
         </w:rPr>
-        <w:t xml:space="preserve">hacia modelos de </w:t>
+        <w:t>Por lo anterior,</w:t>
       </w:r>
       <w:r>
         <w:rPr>
@@ -738,141 +828,99 @@
           <w:sz w:val="22"/>
           <w:szCs w:val="22"/>
         </w:rPr>
-        <w:lastRenderedPageBreak/>
-        <w:t>operación más ágiles, escalables y sostenibles en sectores como educación, salud, agricultura, industria y administración pública.</w:t>
-      </w:r>
-    </w:p>
-    <w:p>
-      <w:pPr>
-        <w:pStyle w:val="NormalWeb"/>
-        <w:jc w:val="both"/>
+        <w:t xml:space="preserve"> </w:t>
+      </w:r>
+      <w:r>
+        <w:rPr>
+          <w:rFonts w:asciiTheme="majorHAnsi" w:hAnsiTheme="majorHAnsi" w:cstheme="majorHAnsi"/>
+          <w:color w:val="000000" w:themeColor="text1"/>
+          <w:sz w:val="22"/>
+          <w:szCs w:val="22"/>
+        </w:rPr>
+        <w:t>l</w:t>
+      </w:r>
+      <w:r>
+        <w:rPr>
+          <w:rFonts w:asciiTheme="majorHAnsi" w:hAnsiTheme="majorHAnsi" w:cstheme="majorHAnsi"/>
+          <w:color w:val="000000" w:themeColor="text1"/>
+          <w:sz w:val="22"/>
+          <w:szCs w:val="22"/>
+        </w:rPr>
+        <w:t>a Dirección de Formación Profesional (DFP)</w:t>
+      </w:r>
+      <w:r>
+        <w:rPr>
+          <w:rStyle w:val="Refdenotaalpie"/>
+          <w:rFonts w:asciiTheme="majorHAnsi" w:hAnsiTheme="majorHAnsi" w:cstheme="majorHAnsi"/>
+          <w:color w:val="000000" w:themeColor="text1"/>
+          <w:sz w:val="22"/>
+          <w:szCs w:val="22"/>
+        </w:rPr>
+        <w:t xml:space="preserve"> </w:t>
+      </w:r>
+      <w:r>
+        <w:rPr>
+          <w:rStyle w:val="Refdenotaalpie"/>
+          <w:rFonts w:asciiTheme="majorHAnsi" w:hAnsiTheme="majorHAnsi" w:cstheme="majorHAnsi"/>
+          <w:color w:val="000000" w:themeColor="text1"/>
+          <w:sz w:val="22"/>
+          <w:szCs w:val="22"/>
+        </w:rPr>
+        <w:footnoteReference w:id="1"/>
+      </w:r>
+      <w:r>
+        <w:rPr>
+          <w:rFonts w:asciiTheme="majorHAnsi" w:hAnsiTheme="majorHAnsi" w:cstheme="majorHAnsi"/>
+          <w:color w:val="000000" w:themeColor="text1"/>
+          <w:sz w:val="22"/>
+          <w:szCs w:val="22"/>
+        </w:rPr>
+        <w:t xml:space="preserve"> en desarrollo de sus objetivos y propósitos, dirigidos a la permanente actualización y desarrollo de competencias que implican un avance en las capacidades y habilidades técnicas de los instructores en la institución, abre </w:t>
+      </w:r>
+      <w:r>
+        <w:rPr>
+          <w:rFonts w:asciiTheme="majorHAnsi" w:hAnsiTheme="majorHAnsi" w:cstheme="majorHAnsi"/>
+          <w:color w:val="000000" w:themeColor="text1"/>
+          <w:sz w:val="22"/>
+          <w:szCs w:val="22"/>
+        </w:rPr>
+        <w:t>la</w:t>
+      </w:r>
+      <w:r>
+        <w:rPr>
+          <w:rFonts w:asciiTheme="majorHAnsi" w:hAnsiTheme="majorHAnsi" w:cstheme="majorHAnsi"/>
+          <w:color w:val="000000" w:themeColor="text1"/>
+          <w:sz w:val="22"/>
+          <w:szCs w:val="22"/>
+        </w:rPr>
+        <w:t xml:space="preserve"> convocatoria</w:t>
+      </w:r>
+      <w:r>
+        <w:rPr>
+          <w:rFonts w:asciiTheme="majorHAnsi" w:hAnsiTheme="majorHAnsi" w:cstheme="majorHAnsi"/>
+          <w:color w:val="000000" w:themeColor="text1"/>
+          <w:sz w:val="22"/>
+          <w:szCs w:val="22"/>
+        </w:rPr>
+        <w:t xml:space="preserve"> </w:t>
+      </w:r>
+      <w:r>
         <w:rPr>
           <w:rFonts w:asciiTheme="majorHAnsi" w:hAnsiTheme="majorHAnsi" w:cstheme="majorHAnsi"/>
           <w:b/>
           <w:bCs/>
         </w:rPr>
-      </w:pPr>
-      <w:r>
-        <w:rPr>
-          <w:rFonts w:asciiTheme="majorHAnsi" w:hAnsiTheme="majorHAnsi" w:cstheme="majorHAnsi"/>
-          <w:color w:val="000000" w:themeColor="text1"/>
-          <w:sz w:val="22"/>
-          <w:szCs w:val="22"/>
-        </w:rPr>
-        <w:t>Por lo anterior,</w:t>
-      </w:r>
-      <w:r>
-        <w:rPr>
-          <w:rFonts w:asciiTheme="majorHAnsi" w:hAnsiTheme="majorHAnsi" w:cstheme="majorHAnsi"/>
-          <w:color w:val="000000" w:themeColor="text1"/>
-          <w:sz w:val="22"/>
-          <w:szCs w:val="22"/>
-        </w:rPr>
-        <w:t xml:space="preserve"> </w:t>
-      </w:r>
-      <w:r>
-        <w:rPr>
-          <w:rFonts w:asciiTheme="majorHAnsi" w:hAnsiTheme="majorHAnsi" w:cstheme="majorHAnsi"/>
-          <w:color w:val="000000" w:themeColor="text1"/>
-          <w:sz w:val="22"/>
-          <w:szCs w:val="22"/>
-        </w:rPr>
-        <w:t>l</w:t>
-      </w:r>
-      <w:r>
-        <w:rPr>
-          <w:rFonts w:asciiTheme="majorHAnsi" w:hAnsiTheme="majorHAnsi" w:cstheme="majorHAnsi"/>
-          <w:color w:val="000000" w:themeColor="text1"/>
-          <w:sz w:val="22"/>
-          <w:szCs w:val="22"/>
-        </w:rPr>
-        <w:t>a Dirección de Formación Profesional (DFP)</w:t>
-      </w:r>
-      <w:r>
-        <w:rPr>
-          <w:rStyle w:val="Refdenotaalpie"/>
-          <w:rFonts w:asciiTheme="majorHAnsi" w:hAnsiTheme="majorHAnsi" w:cstheme="majorHAnsi"/>
-          <w:color w:val="000000" w:themeColor="text1"/>
-          <w:sz w:val="22"/>
-          <w:szCs w:val="22"/>
-        </w:rPr>
-        <w:t xml:space="preserve"> </w:t>
-      </w:r>
-      <w:r>
-        <w:rPr>
-          <w:rStyle w:val="Refdenotaalpie"/>
-          <w:rFonts w:asciiTheme="majorHAnsi" w:hAnsiTheme="majorHAnsi" w:cstheme="majorHAnsi"/>
-          <w:color w:val="000000" w:themeColor="text1"/>
-          <w:sz w:val="22"/>
-          <w:szCs w:val="22"/>
-        </w:rPr>
-        <w:footnoteReference w:id="1"/>
-      </w:r>
-      <w:r>
-        <w:rPr>
-          <w:rFonts w:asciiTheme="majorHAnsi" w:hAnsiTheme="majorHAnsi" w:cstheme="majorHAnsi"/>
-          <w:color w:val="000000" w:themeColor="text1"/>
-          <w:sz w:val="22"/>
-          <w:szCs w:val="22"/>
-        </w:rPr>
-        <w:t xml:space="preserve"> en desarrollo de sus objetivos y propósitos, dirigidos a la permanente actualización y desarrollo de competencias que implican un avance en las capacidades y habilidades técnicas de los instructores en la institución, abre </w:t>
-      </w:r>
-      <w:r>
-        <w:rPr>
-          <w:rFonts w:asciiTheme="majorHAnsi" w:hAnsiTheme="majorHAnsi" w:cstheme="majorHAnsi"/>
-          <w:color w:val="000000" w:themeColor="text1"/>
-          <w:sz w:val="22"/>
-          <w:szCs w:val="22"/>
-        </w:rPr>
-        <w:t>la</w:t>
-      </w:r>
-      <w:r>
-        <w:rPr>
-          <w:rFonts w:asciiTheme="majorHAnsi" w:hAnsiTheme="majorHAnsi" w:cstheme="majorHAnsi"/>
-          <w:color w:val="000000" w:themeColor="text1"/>
-          <w:sz w:val="22"/>
-          <w:szCs w:val="22"/>
-        </w:rPr>
-        <w:t xml:space="preserve"> convocatoria</w:t>
-      </w:r>
-      <w:r>
-        <w:rPr>
-          <w:rFonts w:asciiTheme="majorHAnsi" w:hAnsiTheme="majorHAnsi" w:cstheme="majorHAnsi"/>
-          <w:color w:val="000000" w:themeColor="text1"/>
-          <w:sz w:val="22"/>
-          <w:szCs w:val="22"/>
-        </w:rPr>
-        <w:t xml:space="preserve"> </w:t>
+        <w:t>“</w:t>
       </w:r>
       <w:r>
         <w:rPr>
           <w:rFonts w:asciiTheme="majorHAnsi" w:hAnsiTheme="majorHAnsi" w:cstheme="majorHAnsi"/>
           <w:b/>
           <w:bCs/>
-        </w:rPr>
-        <w:t>“</w:t>
-      </w:r>
-      <w:proofErr w:type="spellStart"/>
-      <w:r>
-        <w:rPr>
-          <w:rFonts w:asciiTheme="majorHAnsi" w:hAnsiTheme="majorHAnsi" w:cstheme="majorHAnsi"/>
-          <w:b/>
-          <w:bCs/>
           <w:color w:val="000000" w:themeColor="text1"/>
           <w:lang w:eastAsia="es-ES"/>
         </w:rPr>
-        <w:t>DevNet</w:t>
-      </w:r>
-      <w:proofErr w:type="spellEnd"/>
-      <w:r>
-        <w:rPr>
-          <w:rFonts w:asciiTheme="majorHAnsi" w:hAnsiTheme="majorHAnsi" w:cstheme="majorHAnsi"/>
-          <w:b/>
-          <w:bCs/>
-          <w:color w:val="000000" w:themeColor="text1"/>
-          <w:lang w:eastAsia="es-ES"/>
-        </w:rPr>
-        <w:t>: Desarrollo de Software para la Automatización de Redes Nivel Básico</w:t>
+        <w:t>DevNet: Desarrollo de Software para la Automatización de Redes Nivel Básico</w:t>
       </w:r>
       <w:r>
         <w:rPr>
@@ -1780,6 +1828,7 @@
           <w:sz w:val="22"/>
           <w:szCs w:val="22"/>
         </w:rPr>
+        <w:lastRenderedPageBreak/>
         <w:t>Jornada Presencial Sincrónica mediada por TIC</w:t>
       </w:r>
       <w:r>
@@ -1986,7 +2035,6 @@
                 <w:b/>
                 <w:color w:val="auto"/>
               </w:rPr>
-              <w:lastRenderedPageBreak/>
               <w:t>Fecha</w:t>
             </w:r>
           </w:p>
@@ -2352,20 +2400,8 @@
                 <w:sz w:val="18"/>
                 <w:szCs w:val="18"/>
               </w:rPr>
-              <w:t xml:space="preserve"> al curso </w:t>
-            </w:r>
-            <w:proofErr w:type="spellStart"/>
-            <w:r>
-              <w:rPr>
-                <w:rFonts w:eastAsiaTheme="minorEastAsia"/>
-                <w:bCs/>
-                <w:color w:val="000000" w:themeColor="text1"/>
-                <w:sz w:val="18"/>
-                <w:szCs w:val="18"/>
-              </w:rPr>
-              <w:t>DevNet</w:t>
-            </w:r>
-            <w:proofErr w:type="spellEnd"/>
+              <w:t xml:space="preserve"> al curso DevNet</w:t>
+            </w:r>
           </w:p>
           <w:p>
             <w:pPr>
@@ -2388,20 +2424,8 @@
                 <w:sz w:val="18"/>
                 <w:szCs w:val="18"/>
               </w:rPr>
-              <w:t xml:space="preserve">Módulo 2 Entorno de desarrolladores de </w:t>
-            </w:r>
-            <w:proofErr w:type="spellStart"/>
-            <w:r>
-              <w:rPr>
-                <w:rFonts w:eastAsiaTheme="minorEastAsia"/>
-                <w:bCs/>
-                <w:color w:val="000000" w:themeColor="text1"/>
-                <w:sz w:val="18"/>
-                <w:szCs w:val="18"/>
-              </w:rPr>
-              <w:t>DevNet</w:t>
-            </w:r>
-            <w:proofErr w:type="spellEnd"/>
+              <w:t>Módulo 2 Entorno de desarrolladores de DevNet</w:t>
+            </w:r>
           </w:p>
           <w:p>
             <w:pPr>
@@ -2450,42 +2474,8 @@
                 <w:sz w:val="18"/>
                 <w:szCs w:val="18"/>
               </w:rPr>
-              <w:t xml:space="preserve">1.2.2 </w:t>
-            </w:r>
-            <w:proofErr w:type="spellStart"/>
-            <w:r>
-              <w:rPr>
-                <w:rFonts w:eastAsiaTheme="minorEastAsia"/>
-                <w:bCs/>
-                <w:color w:val="000000" w:themeColor="text1"/>
-                <w:sz w:val="18"/>
-                <w:szCs w:val="18"/>
-              </w:rPr>
-              <w:t>Lab</w:t>
-            </w:r>
-            <w:proofErr w:type="spellEnd"/>
-            <w:r>
-              <w:rPr>
-                <w:rFonts w:eastAsiaTheme="minorEastAsia"/>
-                <w:bCs/>
-                <w:color w:val="000000" w:themeColor="text1"/>
-                <w:sz w:val="18"/>
-                <w:szCs w:val="18"/>
-              </w:rPr>
-              <w:t xml:space="preserve"> - Linux </w:t>
-            </w:r>
-            <w:proofErr w:type="spellStart"/>
-            <w:r>
-              <w:rPr>
-                <w:rFonts w:eastAsiaTheme="minorEastAsia"/>
-                <w:bCs/>
-                <w:color w:val="000000" w:themeColor="text1"/>
-                <w:sz w:val="18"/>
-                <w:szCs w:val="18"/>
-              </w:rPr>
-              <w:t>Review</w:t>
-            </w:r>
-            <w:proofErr w:type="spellEnd"/>
+              <w:t>1.2.2 Lab - Linux Review</w:t>
+            </w:r>
           </w:p>
         </w:tc>
       </w:tr>
@@ -4862,73 +4852,7 @@
                 <w:sz w:val="18"/>
                 <w:szCs w:val="18"/>
               </w:rPr>
-              <w:t xml:space="preserve">7.0.3 </w:t>
-            </w:r>
-            <w:proofErr w:type="spellStart"/>
-            <w:r>
-              <w:rPr>
-                <w:rFonts w:eastAsiaTheme="minorEastAsia"/>
-                <w:bCs/>
-                <w:color w:val="000000" w:themeColor="text1"/>
-                <w:sz w:val="18"/>
-                <w:szCs w:val="18"/>
-              </w:rPr>
-              <w:t>Lab</w:t>
-            </w:r>
-            <w:proofErr w:type="spellEnd"/>
-            <w:r>
-              <w:rPr>
-                <w:rFonts w:eastAsiaTheme="minorEastAsia"/>
-                <w:bCs/>
-                <w:color w:val="000000" w:themeColor="text1"/>
-                <w:sz w:val="18"/>
-                <w:szCs w:val="18"/>
-              </w:rPr>
-              <w:t xml:space="preserve"> - </w:t>
-            </w:r>
-            <w:proofErr w:type="spellStart"/>
-            <w:r>
-              <w:rPr>
-                <w:rFonts w:eastAsiaTheme="minorEastAsia"/>
-                <w:bCs/>
-                <w:color w:val="000000" w:themeColor="text1"/>
-                <w:sz w:val="18"/>
-                <w:szCs w:val="18"/>
-              </w:rPr>
-              <w:t>Install</w:t>
-            </w:r>
-            <w:proofErr w:type="spellEnd"/>
-            <w:r>
-              <w:rPr>
-                <w:rFonts w:eastAsiaTheme="minorEastAsia"/>
-                <w:bCs/>
-                <w:color w:val="000000" w:themeColor="text1"/>
-                <w:sz w:val="18"/>
-                <w:szCs w:val="18"/>
-              </w:rPr>
-              <w:t xml:space="preserve"> </w:t>
-            </w:r>
-            <w:proofErr w:type="spellStart"/>
-            <w:r>
-              <w:rPr>
-                <w:rFonts w:eastAsiaTheme="minorEastAsia"/>
-                <w:bCs/>
-                <w:color w:val="000000" w:themeColor="text1"/>
-                <w:sz w:val="18"/>
-                <w:szCs w:val="18"/>
-              </w:rPr>
-              <w:t>the</w:t>
-            </w:r>
-            <w:proofErr w:type="spellEnd"/>
-            <w:r>
-              <w:rPr>
-                <w:rFonts w:eastAsiaTheme="minorEastAsia"/>
-                <w:bCs/>
-                <w:color w:val="000000" w:themeColor="text1"/>
-                <w:sz w:val="18"/>
-                <w:szCs w:val="18"/>
-              </w:rPr>
-              <w:t xml:space="preserve"> CSR1000v VM </w:t>
+              <w:t xml:space="preserve">7.0.3 Lab - Install the CSR1000v VM </w:t>
             </w:r>
           </w:p>
           <w:p>
@@ -5009,31 +4933,7 @@
                 <w:szCs w:val="18"/>
                 <w:lang w:val="en-US"/>
               </w:rPr>
-              <w:t xml:space="preserve">7.6.3 Lab - Automated Testing Using </w:t>
-            </w:r>
-            <w:proofErr w:type="spellStart"/>
-            <w:r>
-              <w:rPr>
-                <w:rFonts w:eastAsiaTheme="minorEastAsia"/>
-                <w:bCs/>
-                <w:color w:val="000000" w:themeColor="text1"/>
-                <w:sz w:val="18"/>
-                <w:szCs w:val="18"/>
-                <w:lang w:val="en-US"/>
-              </w:rPr>
-              <w:t>pyATS</w:t>
-            </w:r>
-            <w:proofErr w:type="spellEnd"/>
-            <w:r>
-              <w:rPr>
-                <w:rFonts w:eastAsiaTheme="minorEastAsia"/>
-                <w:bCs/>
-                <w:color w:val="000000" w:themeColor="text1"/>
-                <w:sz w:val="18"/>
-                <w:szCs w:val="18"/>
-                <w:lang w:val="en-US"/>
-              </w:rPr>
-              <w:t xml:space="preserve"> and Genie</w:t>
+              <w:t>7.6.3 Lab - Automated Testing Using pyATS and Genie</w:t>
             </w:r>
           </w:p>
           <w:p>
@@ -5581,42 +5481,8 @@
                 <w:sz w:val="18"/>
                 <w:szCs w:val="18"/>
               </w:rPr>
-              <w:t xml:space="preserve">8 Desarrollo y Plataformas de </w:t>
-            </w:r>
-            <w:proofErr w:type="spellStart"/>
-            <w:r>
-              <w:rPr>
-                <w:rFonts w:eastAsiaTheme="minorEastAsia"/>
-                <w:bCs/>
-                <w:color w:val="000000" w:themeColor="text1"/>
-                <w:sz w:val="18"/>
-                <w:szCs w:val="18"/>
-              </w:rPr>
-              <w:t>CiscoExternal</w:t>
-            </w:r>
-            <w:proofErr w:type="spellEnd"/>
-            <w:r>
-              <w:rPr>
-                <w:rFonts w:eastAsiaTheme="minorEastAsia"/>
-                <w:bCs/>
-                <w:color w:val="000000" w:themeColor="text1"/>
-                <w:sz w:val="18"/>
-                <w:szCs w:val="18"/>
-              </w:rPr>
-              <w:t xml:space="preserve"> </w:t>
-            </w:r>
-            <w:proofErr w:type="spellStart"/>
-            <w:r>
-              <w:rPr>
-                <w:rFonts w:eastAsiaTheme="minorEastAsia"/>
-                <w:bCs/>
-                <w:color w:val="000000" w:themeColor="text1"/>
-                <w:sz w:val="18"/>
-                <w:szCs w:val="18"/>
-              </w:rPr>
-              <w:t>tool</w:t>
-            </w:r>
-            <w:proofErr w:type="spellEnd"/>
+              <w:t>8 Desarrollo y Plataformas de CiscoExternal tool</w:t>
+            </w:r>
           </w:p>
           <w:p>
             <w:pPr>
@@ -6167,21 +6033,7 @@
         <w:rPr>
           <w:bCs/>
         </w:rPr>
-        <w:t xml:space="preserve">y Certificación en plataforma de Cisco </w:t>
-      </w:r>
-      <w:proofErr w:type="spellStart"/>
-      <w:r>
-        <w:rPr>
-          <w:bCs/>
-        </w:rPr>
-        <w:t>Netacad</w:t>
-      </w:r>
-      <w:proofErr w:type="spellEnd"/>
-      <w:r>
-        <w:rPr>
-          <w:bCs/>
-        </w:rPr>
-        <w:t xml:space="preserve"> </w:t>
+        <w:t xml:space="preserve">y Certificación en plataforma de Cisco Netacad </w:t>
       </w:r>
     </w:p>
     <w:p>
@@ -6948,7 +6800,6 @@
                 <w:color w:val="000000" w:themeColor="text1"/>
               </w:rPr>
             </w:pPr>
-            <w:proofErr w:type="spellStart"/>
             <w:r>
               <w:rPr>
                 <w:rFonts w:asciiTheme="majorHAnsi" w:hAnsiTheme="majorHAnsi" w:cstheme="majorHAnsi"/>
@@ -6957,7 +6808,6 @@
               </w:rPr>
               <w:t>Teams</w:t>
             </w:r>
-            <w:proofErr w:type="spellEnd"/>
             <w:r>
               <w:rPr>
                 <w:rFonts w:asciiTheme="majorHAnsi" w:hAnsiTheme="majorHAnsi" w:cstheme="majorHAnsi"/>
@@ -6974,23 +6824,13 @@
               </w:rPr>
               <w:t xml:space="preserve"> </w:t>
             </w:r>
-            <w:proofErr w:type="spellStart"/>
             <w:r>
               <w:rPr>
                 <w:rFonts w:asciiTheme="majorHAnsi" w:hAnsiTheme="majorHAnsi" w:cstheme="majorHAnsi"/>
                 <w:bCs/>
                 <w:color w:val="000000" w:themeColor="text1"/>
               </w:rPr>
-              <w:t>Webex</w:t>
-            </w:r>
-            <w:proofErr w:type="spellEnd"/>
-            <w:r>
-              <w:rPr>
-                <w:rFonts w:asciiTheme="majorHAnsi" w:hAnsiTheme="majorHAnsi" w:cstheme="majorHAnsi"/>
-                <w:bCs/>
-                <w:color w:val="000000" w:themeColor="text1"/>
-              </w:rPr>
-              <w:t xml:space="preserve"> </w:t>
+              <w:t xml:space="preserve">Webex </w:t>
             </w:r>
             <w:r>
               <w:rPr>
@@ -8050,28 +7890,13 @@
           <w:b/>
           <w:bCs/>
         </w:rPr>
-        <w:t xml:space="preserve">, </w:t>
+        <w:t>, 21730061         FUNDAMENTOS DE PROGRAMACIÓN  60 horas</w:t>
       </w:r>
       <w:r>
         <w:rPr>
           <w:b/>
           <w:bCs/>
         </w:rPr>
-        <w:t xml:space="preserve">21730061         FUNDAMENTOS DE PROGRAMACIÓN  60 </w:t>
-      </w:r>
-      <w:proofErr w:type="gramStart"/>
-      <w:r>
-        <w:rPr>
-          <w:b/>
-          <w:bCs/>
-        </w:rPr>
-        <w:t>horas</w:t>
-      </w:r>
-      <w:r>
-        <w:rPr>
-          <w:b/>
-          <w:bCs/>
-        </w:rPr>
         <w:t xml:space="preserve"> </w:t>
       </w:r>
       <w:r>
@@ -8088,7 +7913,6 @@
         </w:rPr>
         <w:t>ara</w:t>
       </w:r>
-      <w:proofErr w:type="gramEnd"/>
       <w:r>
         <w:rPr>
           <w:rFonts w:asciiTheme="majorHAnsi" w:hAnsiTheme="majorHAnsi" w:cstheme="majorHAnsi"/>
@@ -8761,21 +8585,12 @@
         </w:rPr>
         <w:tab/>
       </w:r>
-      <w:proofErr w:type="spellStart"/>
-      <w:r>
-        <w:rPr>
-          <w:rFonts w:asciiTheme="majorHAnsi" w:hAnsiTheme="majorHAnsi" w:cstheme="majorHAnsi"/>
-          <w:color w:val="000000" w:themeColor="text1"/>
-        </w:rPr>
-        <w:t>CC_No</w:t>
-      </w:r>
-      <w:proofErr w:type="spellEnd"/>
-      <w:r>
-        <w:rPr>
-          <w:rFonts w:asciiTheme="majorHAnsi" w:hAnsiTheme="majorHAnsi" w:cstheme="majorHAnsi"/>
-          <w:color w:val="000000" w:themeColor="text1"/>
-        </w:rPr>
-        <w:t>. CÉDULA _Nombre del instructor Ejemplo: CC_12345678_ Jaime López</w:t>
+      <w:r>
+        <w:rPr>
+          <w:rFonts w:asciiTheme="majorHAnsi" w:hAnsiTheme="majorHAnsi" w:cstheme="majorHAnsi"/>
+          <w:color w:val="000000" w:themeColor="text1"/>
+        </w:rPr>
+        <w:t>CC_No. CÉDULA _Nombre del instructor Ejemplo: CC_12345678_ Jaime López</w:t>
       </w:r>
     </w:p>
     <w:p>
@@ -8823,46 +8638,12 @@
         </w:rPr>
         <w:tab/>
       </w:r>
-      <w:proofErr w:type="spellStart"/>
-      <w:r>
-        <w:rPr>
-          <w:rFonts w:asciiTheme="majorHAnsi" w:hAnsiTheme="majorHAnsi" w:cstheme="majorHAnsi"/>
-          <w:color w:val="000000" w:themeColor="text1"/>
-        </w:rPr>
-        <w:t>ACTA_CC_</w:t>
-      </w:r>
-      <w:proofErr w:type="gramStart"/>
-      <w:r>
-        <w:rPr>
-          <w:rFonts w:asciiTheme="majorHAnsi" w:hAnsiTheme="majorHAnsi" w:cstheme="majorHAnsi"/>
-          <w:color w:val="000000" w:themeColor="text1"/>
-        </w:rPr>
-        <w:t>No.CÉDULA</w:t>
-      </w:r>
-      <w:proofErr w:type="spellEnd"/>
-      <w:proofErr w:type="gramEnd"/>
-      <w:r>
-        <w:rPr>
-          <w:rFonts w:asciiTheme="majorHAnsi" w:hAnsiTheme="majorHAnsi" w:cstheme="majorHAnsi"/>
-          <w:color w:val="000000" w:themeColor="text1"/>
-        </w:rPr>
-        <w:t xml:space="preserve"> _Jaime López (</w:t>
-      </w:r>
-      <w:proofErr w:type="gramStart"/>
-      <w:r>
-        <w:rPr>
-          <w:rFonts w:asciiTheme="majorHAnsi" w:hAnsiTheme="majorHAnsi" w:cstheme="majorHAnsi"/>
-          <w:color w:val="000000" w:themeColor="text1"/>
-        </w:rPr>
-        <w:t>PDF)  Ejemplo</w:t>
-      </w:r>
-      <w:proofErr w:type="gramEnd"/>
-      <w:r>
-        <w:rPr>
-          <w:rFonts w:asciiTheme="majorHAnsi" w:hAnsiTheme="majorHAnsi" w:cstheme="majorHAnsi"/>
-          <w:color w:val="000000" w:themeColor="text1"/>
-        </w:rPr>
-        <w:t>: ACTA_CC_12345678_ Jaime López</w:t>
+      <w:r>
+        <w:rPr>
+          <w:rFonts w:asciiTheme="majorHAnsi" w:hAnsiTheme="majorHAnsi" w:cstheme="majorHAnsi"/>
+          <w:color w:val="000000" w:themeColor="text1"/>
+        </w:rPr>
+        <w:t>ACTA_CC_No.CÉDULA _Jaime López (PDF)  Ejemplo: ACTA_CC_12345678_ Jaime López</w:t>
       </w:r>
     </w:p>
     <w:p>
@@ -10685,21 +10466,12 @@
         </w:rPr>
         <w:t xml:space="preserve"> </w:t>
       </w:r>
-      <w:proofErr w:type="spellStart"/>
-      <w:r>
-        <w:rPr>
-          <w:rFonts w:asciiTheme="majorHAnsi" w:hAnsiTheme="majorHAnsi" w:cstheme="majorHAnsi"/>
-          <w:color w:val="000000" w:themeColor="text1"/>
-        </w:rPr>
-        <w:t>CompromISO</w:t>
-      </w:r>
-      <w:proofErr w:type="spellEnd"/>
-      <w:r>
-        <w:rPr>
-          <w:rFonts w:asciiTheme="majorHAnsi" w:hAnsiTheme="majorHAnsi" w:cstheme="majorHAnsi"/>
-          <w:color w:val="000000" w:themeColor="text1"/>
-        </w:rPr>
-        <w:t>.</w:t>
+      <w:r>
+        <w:rPr>
+          <w:rFonts w:asciiTheme="majorHAnsi" w:hAnsiTheme="majorHAnsi" w:cstheme="majorHAnsi"/>
+          <w:color w:val="000000" w:themeColor="text1"/>
+        </w:rPr>
+        <w:t>CompromISO.</w:t>
       </w:r>
     </w:p>
     <w:p>
@@ -10981,23 +10753,13 @@
           <w:color w:val="000000" w:themeColor="text1"/>
         </w:rPr>
       </w:pPr>
-      <w:proofErr w:type="spellStart"/>
       <w:r>
         <w:rPr>
           <w:rFonts w:asciiTheme="majorHAnsi" w:hAnsiTheme="majorHAnsi" w:cstheme="majorHAnsi"/>
           <w:b/>
           <w:color w:val="000000" w:themeColor="text1"/>
         </w:rPr>
-        <w:t>Dannin</w:t>
-      </w:r>
-      <w:proofErr w:type="spellEnd"/>
-      <w:r>
-        <w:rPr>
-          <w:rFonts w:asciiTheme="majorHAnsi" w:hAnsiTheme="majorHAnsi" w:cstheme="majorHAnsi"/>
-          <w:b/>
-          <w:color w:val="000000" w:themeColor="text1"/>
-        </w:rPr>
-        <w:t xml:space="preserve"> Leonardo Gómez Rodríguez</w:t>
+        <w:t>Dannin Leonardo Gómez Rodríguez</w:t>
       </w:r>
     </w:p>
     <w:p>
@@ -11153,7 +10915,7 @@
 </file>
 
 <file path=word/endnotes.xml><?xml version="1.0" encoding="utf-8"?>
-<w:endnotes xmlns:wpc="http://schemas.microsoft.com/office/word/2010/wordprocessingCanvas" xmlns:cx="http://schemas.microsoft.com/office/drawing/2014/chartex" xmlns:cx1="http://schemas.microsoft.com/office/drawing/2015/9/8/chartex" xmlns:cx2="http://schemas.microsoft.com/office/drawing/2015/10/21/chartex" xmlns:cx3="http://schemas.microsoft.com/office/drawing/2016/5/9/chartex" xmlns:cx4="http://schemas.microsoft.com/office/drawing/2016/5/10/chartex" xmlns:cx5="http://schemas.microsoft.com/office/drawing/2016/5/11/chartex" xmlns:cx6="http://schemas.microsoft.com/office/drawing/2016/5/12/chartex" xmlns:cx7="http://schemas.microsoft.com/office/drawing/2016/5/13/chartex" xmlns:cx8="http://schemas.microsoft.com/office/drawing/2016/5/14/chartex" xmlns:mc="http://schemas.openxmlformats.org/markup-compatibility/2006" xmlns:aink="http://schemas.microsoft.com/office/drawing/2016/ink" xmlns:am3d="http://schemas.microsoft.com/office/drawing/2017/model3d" xmlns:o="urn:schemas-microsoft-com:office:office" xmlns:oel="http://schemas.microsoft.com/office/2019/extlst" xmlns:r="http://schemas.openxmlformats.org/officeDocument/2006/relationships" xmlns:m="http://schemas.openxmlformats.org/officeDocument/2006/math" xmlns:v="urn:schemas-microsoft-com:vml" xmlns:wp14="http://schemas.microsoft.com/office/word/2010/wordprocessingDrawing" xmlns:wp="http://schemas.openxmlformats.org/drawingml/2006/wordprocessingDrawing" xmlns:w10="urn:schemas-microsoft-com:office:word" xmlns:w="http://schemas.openxmlformats.org/wordprocessingml/2006/main" xmlns:w14="http://schemas.microsoft.com/office/word/2010/wordml" xmlns:w15="http://schemas.microsoft.com/office/word/2012/wordml" xmlns:w16cex="http://schemas.microsoft.com/office/word/2018/wordml/cex" xmlns:w16cid="http://schemas.microsoft.com/office/word/2016/wordml/cid" xmlns:w16="http://schemas.microsoft.com/office/word/2018/wordml" xmlns:w16du="http://schemas.microsoft.com/office/word/2023/wordml/word16du" xmlns:w16sdtdh="http://schemas.microsoft.com/office/word/2020/wordml/sdtdatahash" xmlns:w16sdtfl="http://schemas.microsoft.com/office/word/2024/wordml/sdtformatlock" xmlns:w16se="http://schemas.microsoft.com/office/word/2015/wordml/symex" xmlns:wpg="http://schemas.microsoft.com/office/word/2010/wordprocessingGroup" xmlns:wpi="http://schemas.microsoft.com/office/word/2010/wordprocessingInk" xmlns:wne="http://schemas.microsoft.com/office/word/2006/wordml" xmlns:wps="http://schemas.microsoft.com/office/word/2010/wordprocessingShape" mc:Ignorable="w14 w15 w16se w16cid w16 w16cex w16sdtdh w16sdtfl w16du wp14">
+<w:endnotes xmlns:wpc="http://schemas.microsoft.com/office/word/2010/wordprocessingCanvas" xmlns:cx="http://schemas.microsoft.com/office/drawing/2014/chartex" xmlns:cx1="http://schemas.microsoft.com/office/drawing/2015/9/8/chartex" xmlns:cx2="http://schemas.microsoft.com/office/drawing/2015/10/21/chartex" xmlns:cx3="http://schemas.microsoft.com/office/drawing/2016/5/9/chartex" xmlns:cx4="http://schemas.microsoft.com/office/drawing/2016/5/10/chartex" xmlns:cx5="http://schemas.microsoft.com/office/drawing/2016/5/11/chartex" xmlns:cx6="http://schemas.microsoft.com/office/drawing/2016/5/12/chartex" xmlns:cx7="http://schemas.microsoft.com/office/drawing/2016/5/13/chartex" xmlns:cx8="http://schemas.microsoft.com/office/drawing/2016/5/14/chartex" xmlns:mc="http://schemas.openxmlformats.org/markup-compatibility/2006" xmlns:aink="http://schemas.microsoft.com/office/drawing/2016/ink" xmlns:am3d="http://schemas.microsoft.com/office/drawing/2017/model3d" xmlns:o="urn:schemas-microsoft-com:office:office" xmlns:r="http://schemas.openxmlformats.org/officeDocument/2006/relationships" xmlns:m="http://schemas.openxmlformats.org/officeDocument/2006/math" xmlns:v="urn:schemas-microsoft-com:vml" xmlns:wp14="http://schemas.microsoft.com/office/word/2010/wordprocessingDrawing" xmlns:wp="http://schemas.openxmlformats.org/drawingml/2006/wordprocessingDrawing" xmlns:w10="urn:schemas-microsoft-com:office:word" xmlns:w="http://schemas.openxmlformats.org/wordprocessingml/2006/main" xmlns:w14="http://schemas.microsoft.com/office/word/2010/wordml" xmlns:w15="http://schemas.microsoft.com/office/word/2012/wordml" xmlns:w16cex="http://schemas.microsoft.com/office/word/2018/wordml/cex" xmlns:w16cid="http://schemas.microsoft.com/office/word/2016/wordml/cid" xmlns:w16="http://schemas.microsoft.com/office/word/2018/wordml" xmlns:w16sdtdh="http://schemas.microsoft.com/office/word/2020/wordml/sdtdatahash" xmlns:w16se="http://schemas.microsoft.com/office/word/2015/wordml/symex" xmlns:wpg="http://schemas.microsoft.com/office/word/2010/wordprocessingGroup" xmlns:wpi="http://schemas.microsoft.com/office/word/2010/wordprocessingInk" xmlns:wne="http://schemas.microsoft.com/office/word/2006/wordml" xmlns:wps="http://schemas.microsoft.com/office/word/2010/wordprocessingShape" mc:Ignorable="w14 w15 w16se w16cid w16 w16cex w16sdtdh wp14">
   <w:endnote w:type="separator" w:id="-1">
     <w:p>
       <w:pPr>
@@ -11178,7 +10940,7 @@
 </file>
 
 <file path=word/footer1.xml><?xml version="1.0" encoding="utf-8"?>
-<w:ftr xmlns:wpc="http://schemas.microsoft.com/office/word/2010/wordprocessingCanvas" xmlns:cx="http://schemas.microsoft.com/office/drawing/2014/chartex" xmlns:cx1="http://schemas.microsoft.com/office/drawing/2015/9/8/chartex" xmlns:cx2="http://schemas.microsoft.com/office/drawing/2015/10/21/chartex" xmlns:cx3="http://schemas.microsoft.com/office/drawing/2016/5/9/chartex" xmlns:cx4="http://schemas.microsoft.com/office/drawing/2016/5/10/chartex" xmlns:cx5="http://schemas.microsoft.com/office/drawing/2016/5/11/chartex" xmlns:cx6="http://schemas.microsoft.com/office/drawing/2016/5/12/chartex" xmlns:cx7="http://schemas.microsoft.com/office/drawing/2016/5/13/chartex" xmlns:cx8="http://schemas.microsoft.com/office/drawing/2016/5/14/chartex" xmlns:mc="http://schemas.openxmlformats.org/markup-compatibility/2006" xmlns:aink="http://schemas.microsoft.com/office/drawing/2016/ink" xmlns:am3d="http://schemas.microsoft.com/office/drawing/2017/model3d" xmlns:o="urn:schemas-microsoft-com:office:office" xmlns:oel="http://schemas.microsoft.com/office/2019/extlst" xmlns:r="http://schemas.openxmlformats.org/officeDocument/2006/relationships" xmlns:m="http://schemas.openxmlformats.org/officeDocument/2006/math" xmlns:v="urn:schemas-microsoft-com:vml" xmlns:wp14="http://schemas.microsoft.com/office/word/2010/wordprocessingDrawing" xmlns:wp="http://schemas.openxmlformats.org/drawingml/2006/wordprocessingDrawing" xmlns:w10="urn:schemas-microsoft-com:office:word" xmlns:w="http://schemas.openxmlformats.org/wordprocessingml/2006/main" xmlns:w14="http://schemas.microsoft.com/office/word/2010/wordml" xmlns:w15="http://schemas.microsoft.com/office/word/2012/wordml" xmlns:w16cex="http://schemas.microsoft.com/office/word/2018/wordml/cex" xmlns:w16cid="http://schemas.microsoft.com/office/word/2016/wordml/cid" xmlns:w16="http://schemas.microsoft.com/office/word/2018/wordml" xmlns:w16du="http://schemas.microsoft.com/office/word/2023/wordml/word16du" xmlns:w16sdtdh="http://schemas.microsoft.com/office/word/2020/wordml/sdtdatahash" xmlns:w16sdtfl="http://schemas.microsoft.com/office/word/2024/wordml/sdtformatlock" xmlns:w16se="http://schemas.microsoft.com/office/word/2015/wordml/symex" xmlns:wpg="http://schemas.microsoft.com/office/word/2010/wordprocessingGroup" xmlns:wpi="http://schemas.microsoft.com/office/word/2010/wordprocessingInk" xmlns:wne="http://schemas.microsoft.com/office/word/2006/wordml" xmlns:wps="http://schemas.microsoft.com/office/word/2010/wordprocessingShape" mc:Ignorable="w14 w15 w16se w16cid w16 w16cex w16sdtdh w16sdtfl w16du wp14">
+<w:ftr xmlns:wpc="http://schemas.microsoft.com/office/word/2010/wordprocessingCanvas" xmlns:cx="http://schemas.microsoft.com/office/drawing/2014/chartex" xmlns:cx1="http://schemas.microsoft.com/office/drawing/2015/9/8/chartex" xmlns:cx2="http://schemas.microsoft.com/office/drawing/2015/10/21/chartex" xmlns:cx3="http://schemas.microsoft.com/office/drawing/2016/5/9/chartex" xmlns:cx4="http://schemas.microsoft.com/office/drawing/2016/5/10/chartex" xmlns:cx5="http://schemas.microsoft.com/office/drawing/2016/5/11/chartex" xmlns:cx6="http://schemas.microsoft.com/office/drawing/2016/5/12/chartex" xmlns:cx7="http://schemas.microsoft.com/office/drawing/2016/5/13/chartex" xmlns:cx8="http://schemas.microsoft.com/office/drawing/2016/5/14/chartex" xmlns:mc="http://schemas.openxmlformats.org/markup-compatibility/2006" xmlns:aink="http://schemas.microsoft.com/office/drawing/2016/ink" xmlns:am3d="http://schemas.microsoft.com/office/drawing/2017/model3d" xmlns:o="urn:schemas-microsoft-com:office:office" xmlns:r="http://schemas.openxmlformats.org/officeDocument/2006/relationships" xmlns:m="http://schemas.openxmlformats.org/officeDocument/2006/math" xmlns:v="urn:schemas-microsoft-com:vml" xmlns:wp14="http://schemas.microsoft.com/office/word/2010/wordprocessingDrawing" xmlns:wp="http://schemas.openxmlformats.org/drawingml/2006/wordprocessingDrawing" xmlns:w10="urn:schemas-microsoft-com:office:word" xmlns:w="http://schemas.openxmlformats.org/wordprocessingml/2006/main" xmlns:w14="http://schemas.microsoft.com/office/word/2010/wordml" xmlns:w15="http://schemas.microsoft.com/office/word/2012/wordml" xmlns:w16cex="http://schemas.microsoft.com/office/word/2018/wordml/cex" xmlns:w16cid="http://schemas.microsoft.com/office/word/2016/wordml/cid" xmlns:w16="http://schemas.microsoft.com/office/word/2018/wordml" xmlns:w16sdtdh="http://schemas.microsoft.com/office/word/2020/wordml/sdtdatahash" xmlns:w16se="http://schemas.microsoft.com/office/word/2015/wordml/symex" xmlns:wpg="http://schemas.microsoft.com/office/word/2010/wordprocessingGroup" xmlns:wpi="http://schemas.microsoft.com/office/word/2010/wordprocessingInk" xmlns:wne="http://schemas.microsoft.com/office/word/2006/wordml" xmlns:wps="http://schemas.microsoft.com/office/word/2010/wordprocessingShape" mc:Ignorable="w14 w15 w16se w16cid w16 w16cex w16sdtdh wp14">
   <w:sdt>
     <w:sdtPr>
       <w:id w:val="-1105643831"/>
@@ -11254,7 +11016,7 @@
 </file>
 
 <file path=word/footnotes.xml><?xml version="1.0" encoding="utf-8"?>
-<w:footnotes xmlns:wpc="http://schemas.microsoft.com/office/word/2010/wordprocessingCanvas" xmlns:cx="http://schemas.microsoft.com/office/drawing/2014/chartex" xmlns:cx1="http://schemas.microsoft.com/office/drawing/2015/9/8/chartex" xmlns:cx2="http://schemas.microsoft.com/office/drawing/2015/10/21/chartex" xmlns:cx3="http://schemas.microsoft.com/office/drawing/2016/5/9/chartex" xmlns:cx4="http://schemas.microsoft.com/office/drawing/2016/5/10/chartex" xmlns:cx5="http://schemas.microsoft.com/office/drawing/2016/5/11/chartex" xmlns:cx6="http://schemas.microsoft.com/office/drawing/2016/5/12/chartex" xmlns:cx7="http://schemas.microsoft.com/office/drawing/2016/5/13/chartex" xmlns:cx8="http://schemas.microsoft.com/office/drawing/2016/5/14/chartex" xmlns:mc="http://schemas.openxmlformats.org/markup-compatibility/2006" xmlns:aink="http://schemas.microsoft.com/office/drawing/2016/ink" xmlns:am3d="http://schemas.microsoft.com/office/drawing/2017/model3d" xmlns:o="urn:schemas-microsoft-com:office:office" xmlns:oel="http://schemas.microsoft.com/office/2019/extlst" xmlns:r="http://schemas.openxmlformats.org/officeDocument/2006/relationships" xmlns:m="http://schemas.openxmlformats.org/officeDocument/2006/math" xmlns:v="urn:schemas-microsoft-com:vml" xmlns:wp14="http://schemas.microsoft.com/office/word/2010/wordprocessingDrawing" xmlns:wp="http://schemas.openxmlformats.org/drawingml/2006/wordprocessingDrawing" xmlns:w10="urn:schemas-microsoft-com:office:word" xmlns:w="http://schemas.openxmlformats.org/wordprocessingml/2006/main" xmlns:w14="http://schemas.microsoft.com/office/word/2010/wordml" xmlns:w15="http://schemas.microsoft.com/office/word/2012/wordml" xmlns:w16cex="http://schemas.microsoft.com/office/word/2018/wordml/cex" xmlns:w16cid="http://schemas.microsoft.com/office/word/2016/wordml/cid" xmlns:w16="http://schemas.microsoft.com/office/word/2018/wordml" xmlns:w16du="http://schemas.microsoft.com/office/word/2023/wordml/word16du" xmlns:w16sdtdh="http://schemas.microsoft.com/office/word/2020/wordml/sdtdatahash" xmlns:w16sdtfl="http://schemas.microsoft.com/office/word/2024/wordml/sdtformatlock" xmlns:w16se="http://schemas.microsoft.com/office/word/2015/wordml/symex" xmlns:wpg="http://schemas.microsoft.com/office/word/2010/wordprocessingGroup" xmlns:wpi="http://schemas.microsoft.com/office/word/2010/wordprocessingInk" xmlns:wne="http://schemas.microsoft.com/office/word/2006/wordml" xmlns:wps="http://schemas.microsoft.com/office/word/2010/wordprocessingShape" mc:Ignorable="w14 w15 w16se w16cid w16 w16cex w16sdtdh w16sdtfl w16du wp14">
+<w:footnotes xmlns:wpc="http://schemas.microsoft.com/office/word/2010/wordprocessingCanvas" xmlns:cx="http://schemas.microsoft.com/office/drawing/2014/chartex" xmlns:cx1="http://schemas.microsoft.com/office/drawing/2015/9/8/chartex" xmlns:cx2="http://schemas.microsoft.com/office/drawing/2015/10/21/chartex" xmlns:cx3="http://schemas.microsoft.com/office/drawing/2016/5/9/chartex" xmlns:cx4="http://schemas.microsoft.com/office/drawing/2016/5/10/chartex" xmlns:cx5="http://schemas.microsoft.com/office/drawing/2016/5/11/chartex" xmlns:cx6="http://schemas.microsoft.com/office/drawing/2016/5/12/chartex" xmlns:cx7="http://schemas.microsoft.com/office/drawing/2016/5/13/chartex" xmlns:cx8="http://schemas.microsoft.com/office/drawing/2016/5/14/chartex" xmlns:mc="http://schemas.openxmlformats.org/markup-compatibility/2006" xmlns:aink="http://schemas.microsoft.com/office/drawing/2016/ink" xmlns:am3d="http://schemas.microsoft.com/office/drawing/2017/model3d" xmlns:o="urn:schemas-microsoft-com:office:office" xmlns:r="http://schemas.openxmlformats.org/officeDocument/2006/relationships" xmlns:m="http://schemas.openxmlformats.org/officeDocument/2006/math" xmlns:v="urn:schemas-microsoft-com:vml" xmlns:wp14="http://schemas.microsoft.com/office/word/2010/wordprocessingDrawing" xmlns:wp="http://schemas.openxmlformats.org/drawingml/2006/wordprocessingDrawing" xmlns:w10="urn:schemas-microsoft-com:office:word" xmlns:w="http://schemas.openxmlformats.org/wordprocessingml/2006/main" xmlns:w14="http://schemas.microsoft.com/office/word/2010/wordml" xmlns:w15="http://schemas.microsoft.com/office/word/2012/wordml" xmlns:w16cex="http://schemas.microsoft.com/office/word/2018/wordml/cex" xmlns:w16cid="http://schemas.microsoft.com/office/word/2016/wordml/cid" xmlns:w16="http://schemas.microsoft.com/office/word/2018/wordml" xmlns:w16sdtdh="http://schemas.microsoft.com/office/word/2020/wordml/sdtdatahash" xmlns:w16se="http://schemas.microsoft.com/office/word/2015/wordml/symex" xmlns:wpg="http://schemas.microsoft.com/office/word/2010/wordprocessingGroup" xmlns:wpi="http://schemas.microsoft.com/office/word/2010/wordprocessingInk" xmlns:wne="http://schemas.microsoft.com/office/word/2006/wordml" xmlns:wps="http://schemas.microsoft.com/office/word/2010/wordprocessingShape" mc:Ignorable="w14 w15 w16se w16cid w16 w16cex w16sdtdh wp14">
   <w:footnote w:type="separator" w:id="-1">
     <w:p>
       <w:pPr>
@@ -11312,7 +11074,7 @@
 </file>
 
 <file path=word/header1.xml><?xml version="1.0" encoding="utf-8"?>
-<w:hdr xmlns:wpc="http://schemas.microsoft.com/office/word/2010/wordprocessingCanvas" xmlns:cx="http://schemas.microsoft.com/office/drawing/2014/chartex" xmlns:cx1="http://schemas.microsoft.com/office/drawing/2015/9/8/chartex" xmlns:cx2="http://schemas.microsoft.com/office/drawing/2015/10/21/chartex" xmlns:cx3="http://schemas.microsoft.com/office/drawing/2016/5/9/chartex" xmlns:cx4="http://schemas.microsoft.com/office/drawing/2016/5/10/chartex" xmlns:cx5="http://schemas.microsoft.com/office/drawing/2016/5/11/chartex" xmlns:cx6="http://schemas.microsoft.com/office/drawing/2016/5/12/chartex" xmlns:cx7="http://schemas.microsoft.com/office/drawing/2016/5/13/chartex" xmlns:cx8="http://schemas.microsoft.com/office/drawing/2016/5/14/chartex" xmlns:mc="http://schemas.openxmlformats.org/markup-compatibility/2006" xmlns:aink="http://schemas.microsoft.com/office/drawing/2016/ink" xmlns:am3d="http://schemas.microsoft.com/office/drawing/2017/model3d" xmlns:o="urn:schemas-microsoft-com:office:office" xmlns:oel="http://schemas.microsoft.com/office/2019/extlst" xmlns:r="http://schemas.openxmlformats.org/officeDocument/2006/relationships" xmlns:m="http://schemas.openxmlformats.org/officeDocument/2006/math" xmlns:v="urn:schemas-microsoft-com:vml" xmlns:wp14="http://schemas.microsoft.com/office/word/2010/wordprocessingDrawing" xmlns:wp="http://schemas.openxmlformats.org/drawingml/2006/wordprocessingDrawing" xmlns:w10="urn:schemas-microsoft-com:office:word" xmlns:w="http://schemas.openxmlformats.org/wordprocessingml/2006/main" xmlns:w14="http://schemas.microsoft.com/office/word/2010/wordml" xmlns:w15="http://schemas.microsoft.com/office/word/2012/wordml" xmlns:w16cex="http://schemas.microsoft.com/office/word/2018/wordml/cex" xmlns:w16cid="http://schemas.microsoft.com/office/word/2016/wordml/cid" xmlns:w16="http://schemas.microsoft.com/office/word/2018/wordml" xmlns:w16du="http://schemas.microsoft.com/office/word/2023/wordml/word16du" xmlns:w16sdtdh="http://schemas.microsoft.com/office/word/2020/wordml/sdtdatahash" xmlns:w16sdtfl="http://schemas.microsoft.com/office/word/2024/wordml/sdtformatlock" xmlns:w16se="http://schemas.microsoft.com/office/word/2015/wordml/symex" xmlns:wpg="http://schemas.microsoft.com/office/word/2010/wordprocessingGroup" xmlns:wpi="http://schemas.microsoft.com/office/word/2010/wordprocessingInk" xmlns:wne="http://schemas.microsoft.com/office/word/2006/wordml" xmlns:wps="http://schemas.microsoft.com/office/word/2010/wordprocessingShape" mc:Ignorable="w14 w15 w16se w16cid w16 w16cex w16sdtdh w16sdtfl w16du wp14">
+<w:hdr xmlns:wpc="http://schemas.microsoft.com/office/word/2010/wordprocessingCanvas" xmlns:cx="http://schemas.microsoft.com/office/drawing/2014/chartex" xmlns:cx1="http://schemas.microsoft.com/office/drawing/2015/9/8/chartex" xmlns:cx2="http://schemas.microsoft.com/office/drawing/2015/10/21/chartex" xmlns:cx3="http://schemas.microsoft.com/office/drawing/2016/5/9/chartex" xmlns:cx4="http://schemas.microsoft.com/office/drawing/2016/5/10/chartex" xmlns:cx5="http://schemas.microsoft.com/office/drawing/2016/5/11/chartex" xmlns:cx6="http://schemas.microsoft.com/office/drawing/2016/5/12/chartex" xmlns:cx7="http://schemas.microsoft.com/office/drawing/2016/5/13/chartex" xmlns:cx8="http://schemas.microsoft.com/office/drawing/2016/5/14/chartex" xmlns:mc="http://schemas.openxmlformats.org/markup-compatibility/2006" xmlns:aink="http://schemas.microsoft.com/office/drawing/2016/ink" xmlns:am3d="http://schemas.microsoft.com/office/drawing/2017/model3d" xmlns:o="urn:schemas-microsoft-com:office:office" xmlns:r="http://schemas.openxmlformats.org/officeDocument/2006/relationships" xmlns:m="http://schemas.openxmlformats.org/officeDocument/2006/math" xmlns:v="urn:schemas-microsoft-com:vml" xmlns:wp14="http://schemas.microsoft.com/office/word/2010/wordprocessingDrawing" xmlns:wp="http://schemas.openxmlformats.org/drawingml/2006/wordprocessingDrawing" xmlns:w10="urn:schemas-microsoft-com:office:word" xmlns:w="http://schemas.openxmlformats.org/wordprocessingml/2006/main" xmlns:w14="http://schemas.microsoft.com/office/word/2010/wordml" xmlns:w15="http://schemas.microsoft.com/office/word/2012/wordml" xmlns:w16cex="http://schemas.microsoft.com/office/word/2018/wordml/cex" xmlns:w16cid="http://schemas.microsoft.com/office/word/2016/wordml/cid" xmlns:w16="http://schemas.microsoft.com/office/word/2018/wordml" xmlns:w16sdtdh="http://schemas.microsoft.com/office/word/2020/wordml/sdtdatahash" xmlns:w16se="http://schemas.microsoft.com/office/word/2015/wordml/symex" xmlns:wpg="http://schemas.microsoft.com/office/word/2010/wordprocessingGroup" xmlns:wpi="http://schemas.microsoft.com/office/word/2010/wordprocessingInk" xmlns:wne="http://schemas.microsoft.com/office/word/2006/wordml" xmlns:wps="http://schemas.microsoft.com/office/word/2010/wordprocessingShape" mc:Ignorable="w14 w15 w16se w16cid w16 w16cex w16sdtdh wp14">
   <w:p>
     <w:pPr>
       <w:pStyle w:val="Encabezado"/>
@@ -11376,7 +11138,7 @@
 </file>
 
 <file path=word/numbering.xml><?xml version="1.0" encoding="utf-8"?>
-<w:numbering xmlns:wpc="http://schemas.microsoft.com/office/word/2010/wordprocessingCanvas" xmlns:cx="http://schemas.microsoft.com/office/drawing/2014/chartex" xmlns:cx1="http://schemas.microsoft.com/office/drawing/2015/9/8/chartex" xmlns:cx2="http://schemas.microsoft.com/office/drawing/2015/10/21/chartex" xmlns:cx3="http://schemas.microsoft.com/office/drawing/2016/5/9/chartex" xmlns:cx4="http://schemas.microsoft.com/office/drawing/2016/5/10/chartex" xmlns:cx5="http://schemas.microsoft.com/office/drawing/2016/5/11/chartex" xmlns:cx6="http://schemas.microsoft.com/office/drawing/2016/5/12/chartex" xmlns:cx7="http://schemas.microsoft.com/office/drawing/2016/5/13/chartex" xmlns:cx8="http://schemas.microsoft.com/office/drawing/2016/5/14/chartex" xmlns:mc="http://schemas.openxmlformats.org/markup-compatibility/2006" xmlns:aink="http://schemas.microsoft.com/office/drawing/2016/ink" xmlns:am3d="http://schemas.microsoft.com/office/drawing/2017/model3d" xmlns:o="urn:schemas-microsoft-com:office:office" xmlns:oel="http://schemas.microsoft.com/office/2019/extlst" xmlns:r="http://schemas.openxmlformats.org/officeDocument/2006/relationships" xmlns:m="http://schemas.openxmlformats.org/officeDocument/2006/math" xmlns:v="urn:schemas-microsoft-com:vml" xmlns:wp14="http://schemas.microsoft.com/office/word/2010/wordprocessingDrawing" xmlns:wp="http://schemas.openxmlformats.org/drawingml/2006/wordprocessingDrawing" xmlns:w10="urn:schemas-microsoft-com:office:word" xmlns:w="http://schemas.openxmlformats.org/wordprocessingml/2006/main" xmlns:w14="http://schemas.microsoft.com/office/word/2010/wordml" xmlns:w15="http://schemas.microsoft.com/office/word/2012/wordml" xmlns:w16cex="http://schemas.microsoft.com/office/word/2018/wordml/cex" xmlns:w16cid="http://schemas.microsoft.com/office/word/2016/wordml/cid" xmlns:w16="http://schemas.microsoft.com/office/word/2018/wordml" xmlns:w16du="http://schemas.microsoft.com/office/word/2023/wordml/word16du" xmlns:w16sdtdh="http://schemas.microsoft.com/office/word/2020/wordml/sdtdatahash" xmlns:w16sdtfl="http://schemas.microsoft.com/office/word/2024/wordml/sdtformatlock" xmlns:w16se="http://schemas.microsoft.com/office/word/2015/wordml/symex" xmlns:wpg="http://schemas.microsoft.com/office/word/2010/wordprocessingGroup" xmlns:wpi="http://schemas.microsoft.com/office/word/2010/wordprocessingInk" xmlns:wne="http://schemas.microsoft.com/office/word/2006/wordml" xmlns:wps="http://schemas.microsoft.com/office/word/2010/wordprocessingShape" mc:Ignorable="w14 w15 w16se w16cid w16 w16cex w16sdtdh w16sdtfl w16du wp14">
+<w:numbering xmlns:wpc="http://schemas.microsoft.com/office/word/2010/wordprocessingCanvas" xmlns:cx="http://schemas.microsoft.com/office/drawing/2014/chartex" xmlns:cx1="http://schemas.microsoft.com/office/drawing/2015/9/8/chartex" xmlns:cx2="http://schemas.microsoft.com/office/drawing/2015/10/21/chartex" xmlns:cx3="http://schemas.microsoft.com/office/drawing/2016/5/9/chartex" xmlns:cx4="http://schemas.microsoft.com/office/drawing/2016/5/10/chartex" xmlns:cx5="http://schemas.microsoft.com/office/drawing/2016/5/11/chartex" xmlns:cx6="http://schemas.microsoft.com/office/drawing/2016/5/12/chartex" xmlns:cx7="http://schemas.microsoft.com/office/drawing/2016/5/13/chartex" xmlns:cx8="http://schemas.microsoft.com/office/drawing/2016/5/14/chartex" xmlns:mc="http://schemas.openxmlformats.org/markup-compatibility/2006" xmlns:aink="http://schemas.microsoft.com/office/drawing/2016/ink" xmlns:am3d="http://schemas.microsoft.com/office/drawing/2017/model3d" xmlns:o="urn:schemas-microsoft-com:office:office" xmlns:r="http://schemas.openxmlformats.org/officeDocument/2006/relationships" xmlns:m="http://schemas.openxmlformats.org/officeDocument/2006/math" xmlns:v="urn:schemas-microsoft-com:vml" xmlns:wp14="http://schemas.microsoft.com/office/word/2010/wordprocessingDrawing" xmlns:wp="http://schemas.openxmlformats.org/drawingml/2006/wordprocessingDrawing" xmlns:w10="urn:schemas-microsoft-com:office:word" xmlns:w="http://schemas.openxmlformats.org/wordprocessingml/2006/main" xmlns:w14="http://schemas.microsoft.com/office/word/2010/wordml" xmlns:w15="http://schemas.microsoft.com/office/word/2012/wordml" xmlns:w16cex="http://schemas.microsoft.com/office/word/2018/wordml/cex" xmlns:w16cid="http://schemas.microsoft.com/office/word/2016/wordml/cid" xmlns:w16="http://schemas.microsoft.com/office/word/2018/wordml" xmlns:w16sdtdh="http://schemas.microsoft.com/office/word/2020/wordml/sdtdatahash" xmlns:w16se="http://schemas.microsoft.com/office/word/2015/wordml/symex" xmlns:wpg="http://schemas.microsoft.com/office/word/2010/wordprocessingGroup" xmlns:wpi="http://schemas.microsoft.com/office/word/2010/wordprocessingInk" xmlns:wne="http://schemas.microsoft.com/office/word/2006/wordml" xmlns:wps="http://schemas.microsoft.com/office/word/2010/wordprocessingShape" mc:Ignorable="w14 w15 w16se w16cid w16 w16cex w16sdtdh wp14">
   <w:abstractNum w:abstractNumId="0" w15:restartNumberingAfterBreak="0">
     <w:nsid w:val="04653BE8"/>
     <w:multiLevelType w:val="hybridMultilevel"/>
@@ -12805,43 +12567,43 @@
       </w:rPr>
     </w:lvl>
   </w:abstractNum>
-  <w:num w:numId="1" w16cid:durableId="623199414">
+  <w:num w:numId="1">
     <w:abstractNumId w:val="0"/>
   </w:num>
-  <w:num w:numId="2" w16cid:durableId="942029150">
+  <w:num w:numId="2">
     <w:abstractNumId w:val="1"/>
   </w:num>
-  <w:num w:numId="3" w16cid:durableId="1101147859">
+  <w:num w:numId="3">
     <w:abstractNumId w:val="9"/>
   </w:num>
-  <w:num w:numId="4" w16cid:durableId="1053695734">
+  <w:num w:numId="4">
     <w:abstractNumId w:val="2"/>
   </w:num>
-  <w:num w:numId="5" w16cid:durableId="1855143803">
+  <w:num w:numId="5">
     <w:abstractNumId w:val="12"/>
   </w:num>
-  <w:num w:numId="6" w16cid:durableId="851263388">
+  <w:num w:numId="6">
     <w:abstractNumId w:val="7"/>
   </w:num>
-  <w:num w:numId="7" w16cid:durableId="1135878871">
+  <w:num w:numId="7">
     <w:abstractNumId w:val="8"/>
   </w:num>
-  <w:num w:numId="8" w16cid:durableId="1223718254">
+  <w:num w:numId="8">
     <w:abstractNumId w:val="11"/>
   </w:num>
-  <w:num w:numId="9" w16cid:durableId="2029208082">
+  <w:num w:numId="9">
     <w:abstractNumId w:val="5"/>
   </w:num>
-  <w:num w:numId="10" w16cid:durableId="844396772">
+  <w:num w:numId="10">
     <w:abstractNumId w:val="3"/>
   </w:num>
-  <w:num w:numId="11" w16cid:durableId="329454542">
+  <w:num w:numId="11">
     <w:abstractNumId w:val="4"/>
   </w:num>
-  <w:num w:numId="12" w16cid:durableId="692344872">
+  <w:num w:numId="12">
     <w:abstractNumId w:val="6"/>
   </w:num>
-  <w:num w:numId="13" w16cid:durableId="648442780">
+  <w:num w:numId="13">
     <w:abstractNumId w:val="10"/>
   </w:num>
   <w:numIdMacAtCleanup w:val="12"/>
@@ -12849,7 +12611,7 @@
 </file>
 
 <file path=word/styles.xml><?xml version="1.0" encoding="utf-8"?>
-<w:styles xmlns:mc="http://schemas.openxmlformats.org/markup-compatibility/2006" xmlns:r="http://schemas.openxmlformats.org/officeDocument/2006/relationships" xmlns:w="http://schemas.openxmlformats.org/wordprocessingml/2006/main" xmlns:w14="http://schemas.microsoft.com/office/word/2010/wordml" xmlns:w15="http://schemas.microsoft.com/office/word/2012/wordml" xmlns:w16cex="http://schemas.microsoft.com/office/word/2018/wordml/cex" xmlns:w16cid="http://schemas.microsoft.com/office/word/2016/wordml/cid" xmlns:w16="http://schemas.microsoft.com/office/word/2018/wordml" xmlns:w16du="http://schemas.microsoft.com/office/word/2023/wordml/word16du" xmlns:w16sdtdh="http://schemas.microsoft.com/office/word/2020/wordml/sdtdatahash" xmlns:w16sdtfl="http://schemas.microsoft.com/office/word/2024/wordml/sdtformatlock" xmlns:w16se="http://schemas.microsoft.com/office/word/2015/wordml/symex" mc:Ignorable="w14 w15 w16se w16cid w16 w16cex w16sdtdh w16sdtfl w16du">
+<w:styles xmlns:mc="http://schemas.openxmlformats.org/markup-compatibility/2006" xmlns:r="http://schemas.openxmlformats.org/officeDocument/2006/relationships" xmlns:w="http://schemas.openxmlformats.org/wordprocessingml/2006/main" xmlns:w14="http://schemas.microsoft.com/office/word/2010/wordml" xmlns:w15="http://schemas.microsoft.com/office/word/2012/wordml" xmlns:w16cex="http://schemas.microsoft.com/office/word/2018/wordml/cex" xmlns:w16cid="http://schemas.microsoft.com/office/word/2016/wordml/cid" xmlns:w16="http://schemas.microsoft.com/office/word/2018/wordml" xmlns:w16sdtdh="http://schemas.microsoft.com/office/word/2020/wordml/sdtdatahash" xmlns:w16se="http://schemas.microsoft.com/office/word/2015/wordml/symex" mc:Ignorable="w14 w15 w16se w16cid w16 w16cex w16sdtdh">
   <w:docDefaults>
     <w:rPrDefault>
       <w:rPr>
@@ -13319,6 +13081,7 @@
   <w:style w:type="character" w:default="1" w:styleId="Fuentedeprrafopredeter">
     <w:name w:val="Default Paragraph Font"/>
     <w:uiPriority w:val="1"/>
+    <w:semiHidden/>
     <w:unhideWhenUsed/>
   </w:style>
   <w:style w:type="table" w:default="1" w:styleId="Tablanormal">

</xml_diff>